<commit_message>
Added Jeff's notes and the PDF
</commit_message>
<xml_diff>
--- a/round_trip_report_janisch_patai.docx
+++ b/round_trip_report_janisch_patai.docx
@@ -138,12 +138,6 @@
         </w:sdtPr>
         <w:sdtEndPr/>
         <w:sdtContent>
-          <w:r>
-            <w:rPr>
-              <w:lang w:val="en-US"/>
-            </w:rPr>
-            <w:t xml:space="preserve">Jefferson </w:t>
-          </w:r>
           <w:proofErr w:type="spellStart"/>
           <w:r>
             <w:rPr>
@@ -214,52 +208,12 @@
         </w:rPr>
         <w:t xml:space="preserve">By: </w:t>
       </w:r>
-      <w:sdt>
-        <w:sdtPr>
-          <w:rPr>
-            <w:lang w:val="en-US"/>
-          </w:rPr>
-          <w:alias w:val="Autor"/>
-          <w:tag w:val="Autor"/>
-          <w:id w:val="-1679117847"/>
-          <w:placeholder>
-            <w:docPart w:val="C2AD58F72CA045269568DD4C5FB78575"/>
-          </w:placeholder>
-          <w:dataBinding w:prefixMappings="xmlns:ns0='http://purl.org/dc/elements/1.1/' xmlns:ns1='http://schemas.openxmlformats.org/package/2006/metadata/core-properties' " w:xpath="/ns1:coreProperties[1]/ns0:creator[1]" w:storeItemID="{6C3C8BC8-F283-45AE-878A-BAB7291924A1}"/>
-          <w:text/>
-        </w:sdtPr>
-        <w:sdtEndPr/>
-        <w:sdtContent>
-          <w:r>
-            <w:rPr>
-              <w:lang w:val="en-US"/>
-            </w:rPr>
-            <w:t xml:space="preserve">Jefferson </w:t>
-          </w:r>
-          <w:proofErr w:type="spellStart"/>
-          <w:r>
-            <w:rPr>
-              <w:lang w:val="en-US"/>
-            </w:rPr>
-            <w:t>Janisch</w:t>
-          </w:r>
-          <w:proofErr w:type="spellEnd"/>
-          <w:r>
-            <w:rPr>
-              <w:lang w:val="en-US"/>
-            </w:rPr>
-            <w:t xml:space="preserve">, </w:t>
-          </w:r>
-          <w:proofErr w:type="spellStart"/>
-          <w:r>
-            <w:rPr>
-              <w:lang w:val="en-US"/>
-            </w:rPr>
-            <w:t>Bsc</w:t>
-          </w:r>
-          <w:proofErr w:type="spellEnd"/>
-        </w:sdtContent>
-      </w:sdt>
+      <w:r>
+        <w:rPr>
+          <w:lang w:val="en-US"/>
+        </w:rPr>
+        <w:t>Alex Patai</w:t>
+      </w:r>
     </w:p>
     <w:p>
       <w:pPr>
@@ -1742,24 +1696,14 @@
       <w:r>
         <w:t xml:space="preserve">Table </w:t>
       </w:r>
-      <w:r>
-        <w:fldChar w:fldCharType="begin"/>
-      </w:r>
-      <w:r>
-        <w:instrText xml:space="preserve"> SEQ Table \* ARABIC </w:instrText>
-      </w:r>
-      <w:r>
-        <w:fldChar w:fldCharType="separate"/>
-      </w:r>
-      <w:r>
-        <w:rPr>
-          <w:noProof/>
-        </w:rPr>
-        <w:t>1</w:t>
-      </w:r>
-      <w:r>
-        <w:fldChar w:fldCharType="end"/>
-      </w:r>
+      <w:fldSimple w:instr=" SEQ Table \* ARABIC ">
+        <w:r>
+          <w:rPr>
+            <w:noProof/>
+          </w:rPr>
+          <w:t>1</w:t>
+        </w:r>
+      </w:fldSimple>
       <w:r>
         <w:t xml:space="preserve">: IP </w:t>
       </w:r>
@@ -2168,24 +2112,14 @@
       <w:r>
         <w:t xml:space="preserve"> </w:t>
       </w:r>
-      <w:r>
-        <w:fldChar w:fldCharType="begin"/>
-      </w:r>
-      <w:r>
-        <w:instrText xml:space="preserve"> SEQ Figure \* ARABIC </w:instrText>
-      </w:r>
-      <w:r>
-        <w:fldChar w:fldCharType="separate"/>
-      </w:r>
-      <w:r>
-        <w:rPr>
-          <w:noProof/>
-        </w:rPr>
-        <w:t>2</w:t>
-      </w:r>
-      <w:r>
-        <w:fldChar w:fldCharType="end"/>
-      </w:r>
+      <w:fldSimple w:instr=" SEQ Figure \* ARABIC ">
+        <w:r>
+          <w:rPr>
+            <w:noProof/>
+          </w:rPr>
+          <w:t>2</w:t>
+        </w:r>
+      </w:fldSimple>
       <w:bookmarkEnd w:id="8"/>
       <w:r>
         <w:t xml:space="preserve">: </w:t>
@@ -3039,10 +2973,10 @@
             <v:path o:extrusionok="f" gradientshapeok="t" o:connecttype="rect"/>
             <o:lock v:ext="edit" aspectratio="t"/>
           </v:shapetype>
-          <v:shape id="_x0000_i1026" type="#_x0000_t75" style="width:453.75pt;height:682.5pt" o:ole="">
+          <v:shape id="_x0000_i1025" type="#_x0000_t75" style="width:453.75pt;height:682.5pt" o:ole="">
             <v:imagedata r:id="rId22" o:title=""/>
           </v:shape>
-          <o:OLEObject Type="Embed" ProgID="Word.OpenDocumentText.12" ShapeID="_x0000_i1026" DrawAspect="Content" ObjectID="_1807888879" r:id="rId23"/>
+          <o:OLEObject Type="Embed" ProgID="Word.OpenDocumentText.12" ShapeID="_x0000_i1025" DrawAspect="Content" ObjectID="_1808060414" r:id="rId23"/>
         </w:object>
       </w:r>
     </w:p>
@@ -4555,10 +4489,10 @@
           <w:lang w:val="de-AT" w:eastAsia="en-US" w:bidi="en-US"/>
         </w:rPr>
         <w:object w:dxaOrig="9072" w:dyaOrig="5730" w14:anchorId="0870A2D1">
-          <v:shape id="_x0000_i1029" type="#_x0000_t75" style="width:453.75pt;height:286.5pt" o:ole="">
+          <v:shape id="_x0000_i1026" type="#_x0000_t75" style="width:453.75pt;height:286.5pt" o:ole="">
             <v:imagedata r:id="rId24" o:title=""/>
           </v:shape>
-          <o:OLEObject Type="Embed" ProgID="Word.OpenDocumentText.12" ShapeID="_x0000_i1029" DrawAspect="Content" ObjectID="_1807888880" r:id="rId25"/>
+          <o:OLEObject Type="Embed" ProgID="Word.OpenDocumentText.12" ShapeID="_x0000_i1026" DrawAspect="Content" ObjectID="_1808060415" r:id="rId25"/>
         </w:object>
       </w:r>
     </w:p>
@@ -5281,24 +5215,14 @@
       <w:r>
         <w:t xml:space="preserve">Table </w:t>
       </w:r>
-      <w:r>
-        <w:fldChar w:fldCharType="begin"/>
-      </w:r>
-      <w:r>
-        <w:instrText xml:space="preserve"> SEQ Table \* ARABIC </w:instrText>
-      </w:r>
-      <w:r>
-        <w:fldChar w:fldCharType="separate"/>
-      </w:r>
-      <w:r>
-        <w:rPr>
-          <w:noProof/>
-        </w:rPr>
-        <w:t>2</w:t>
-      </w:r>
-      <w:r>
-        <w:fldChar w:fldCharType="end"/>
-      </w:r>
+      <w:fldSimple w:instr=" SEQ Table \* ARABIC ">
+        <w:r>
+          <w:rPr>
+            <w:noProof/>
+          </w:rPr>
+          <w:t>2</w:t>
+        </w:r>
+      </w:fldSimple>
       <w:r>
         <w:t xml:space="preserve">: Minimum, </w:t>
       </w:r>
@@ -5653,7 +5577,7 @@
         <w:rPr>
           <w:noProof/>
         </w:rPr>
-        <w:t>2</w:t>
+        <w:t>3</w:t>
       </w:r>
       <w:r>
         <w:rPr>
@@ -5762,24 +5686,14 @@
       <w:r>
         <w:t xml:space="preserve"> </w:t>
       </w:r>
-      <w:r>
-        <w:fldChar w:fldCharType="begin"/>
-      </w:r>
-      <w:r>
-        <w:instrText xml:space="preserve"> SEQ Figure \* ARABIC </w:instrText>
-      </w:r>
-      <w:r>
-        <w:fldChar w:fldCharType="separate"/>
-      </w:r>
-      <w:r>
-        <w:rPr>
-          <w:noProof/>
-        </w:rPr>
-        <w:t>3</w:t>
-      </w:r>
-      <w:r>
-        <w:fldChar w:fldCharType="end"/>
-      </w:r>
+      <w:fldSimple w:instr=" SEQ Figure \* ARABIC ">
+        <w:r>
+          <w:rPr>
+            <w:noProof/>
+          </w:rPr>
+          <w:t>3</w:t>
+        </w:r>
+      </w:fldSimple>
       <w:bookmarkEnd w:id="17"/>
       <w:r>
         <w:t xml:space="preserve">: 50.000 </w:t>
@@ -5922,24 +5836,14 @@
       <w:r>
         <w:t xml:space="preserve">Table </w:t>
       </w:r>
-      <w:r>
-        <w:fldChar w:fldCharType="begin"/>
-      </w:r>
-      <w:r>
-        <w:instrText xml:space="preserve"> SEQ Table \* ARABIC </w:instrText>
-      </w:r>
-      <w:r>
-        <w:fldChar w:fldCharType="separate"/>
-      </w:r>
-      <w:r>
-        <w:rPr>
-          <w:noProof/>
-        </w:rPr>
-        <w:t>3</w:t>
-      </w:r>
-      <w:r>
-        <w:fldChar w:fldCharType="end"/>
-      </w:r>
+      <w:fldSimple w:instr=" SEQ Table \* ARABIC ">
+        <w:r>
+          <w:rPr>
+            <w:noProof/>
+          </w:rPr>
+          <w:t>3</w:t>
+        </w:r>
+      </w:fldSimple>
       <w:bookmarkEnd w:id="20"/>
       <w:r>
         <w:t xml:space="preserve">: Minimum, </w:t>
@@ -6347,7 +6251,7 @@
         <w:rPr>
           <w:noProof/>
         </w:rPr>
-        <w:t>3</w:t>
+        <w:t>4</w:t>
       </w:r>
       <w:r>
         <w:rPr>
@@ -6441,24 +6345,14 @@
       <w:r>
         <w:t xml:space="preserve"> </w:t>
       </w:r>
-      <w:r>
-        <w:fldChar w:fldCharType="begin"/>
-      </w:r>
-      <w:r>
-        <w:instrText xml:space="preserve"> SEQ Figure \* ARABIC </w:instrText>
-      </w:r>
-      <w:r>
-        <w:fldChar w:fldCharType="separate"/>
-      </w:r>
-      <w:r>
-        <w:rPr>
-          <w:noProof/>
-        </w:rPr>
-        <w:t>4</w:t>
-      </w:r>
-      <w:r>
-        <w:fldChar w:fldCharType="end"/>
-      </w:r>
+      <w:fldSimple w:instr=" SEQ Figure \* ARABIC ">
+        <w:r>
+          <w:rPr>
+            <w:noProof/>
+          </w:rPr>
+          <w:t>4</w:t>
+        </w:r>
+      </w:fldSimple>
       <w:bookmarkEnd w:id="22"/>
       <w:r>
         <w:t xml:space="preserve">: 50.000 </w:t>
@@ -6527,182 +6421,78 @@
     <w:p>
       <w:pPr>
         <w:rPr>
-          <w:b/>
-          <w:color w:val="FF0000"/>
           <w:lang w:val="en-GB"/>
         </w:rPr>
       </w:pPr>
       <w:r>
         <w:rPr>
-          <w:b/>
-          <w:color w:val="FF0000"/>
           <w:lang w:val="en-GB"/>
         </w:rPr>
-        <w:t xml:space="preserve">Jeff: </w:t>
-      </w:r>
-      <w:proofErr w:type="spellStart"/>
-      <w:r>
-        <w:rPr>
-          <w:b/>
-          <w:color w:val="FF0000"/>
+        <w:t xml:space="preserve">To achieve a high CPU load, the terminal command “yes &amp;&gt; /dev/null &amp;”, which occupies the CPU by writing “yes” to “/dev/null” continuously. The ampersand character ensures that the </w:t>
+      </w:r>
+      <w:r>
+        <w:rPr>
           <w:lang w:val="en-GB"/>
         </w:rPr>
-        <w:t>kannst</w:t>
-      </w:r>
-      <w:proofErr w:type="spellEnd"/>
-      <w:r>
-        <w:rPr>
-          <w:b/>
-          <w:color w:val="FF0000"/>
+        <w:lastRenderedPageBreak/>
+        <w:t xml:space="preserve">task </w:t>
+      </w:r>
+      <w:proofErr w:type="gramStart"/>
+      <w:r>
+        <w:rPr>
           <w:lang w:val="en-GB"/>
         </w:rPr>
-        <w:t xml:space="preserve"> </w:t>
-      </w:r>
-      <w:proofErr w:type="spellStart"/>
-      <w:r>
-        <w:rPr>
-          <w:b/>
-          <w:color w:val="FF0000"/>
+        <w:t>is sent</w:t>
+      </w:r>
+      <w:proofErr w:type="gramEnd"/>
+      <w:r>
+        <w:rPr>
           <w:lang w:val="en-GB"/>
         </w:rPr>
-        <w:t>hier</w:t>
-      </w:r>
-      <w:proofErr w:type="spellEnd"/>
-      <w:r>
-        <w:rPr>
-          <w:b/>
-          <w:color w:val="FF0000"/>
+        <w:t xml:space="preserve"> to the background. The above-mentioned command </w:t>
+      </w:r>
+      <w:proofErr w:type="gramStart"/>
+      <w:r>
+        <w:rPr>
           <w:lang w:val="en-GB"/>
         </w:rPr>
-        <w:t xml:space="preserve"> </w:t>
-      </w:r>
-      <w:proofErr w:type="spellStart"/>
-      <w:r>
-        <w:rPr>
-          <w:b/>
-          <w:color w:val="FF0000"/>
+        <w:t>has been repeatedly executed</w:t>
+      </w:r>
+      <w:proofErr w:type="gramEnd"/>
+      <w:r>
+        <w:rPr>
           <w:lang w:val="en-GB"/>
         </w:rPr>
-        <w:t>bitte</w:t>
-      </w:r>
-      <w:proofErr w:type="spellEnd"/>
-      <w:r>
-        <w:rPr>
-          <w:b/>
-          <w:color w:val="FF0000"/>
+        <w:t xml:space="preserve"> 10 times, which caused a significant and observable </w:t>
+      </w:r>
+      <w:r>
+        <w:rPr>
           <w:lang w:val="en-GB"/>
         </w:rPr>
-        <w:t xml:space="preserve"> </w:t>
-      </w:r>
-      <w:proofErr w:type="spellStart"/>
-      <w:r>
-        <w:rPr>
-          <w:b/>
-          <w:color w:val="FF0000"/>
-          <w:lang w:val="en-GB"/>
-        </w:rPr>
-        <w:t>kurz</w:t>
-      </w:r>
-      <w:proofErr w:type="spellEnd"/>
-      <w:r>
-        <w:rPr>
-          <w:b/>
-          <w:color w:val="FF0000"/>
-          <w:lang w:val="en-GB"/>
-        </w:rPr>
-        <w:t xml:space="preserve"> </w:t>
-      </w:r>
-      <w:proofErr w:type="spellStart"/>
-      <w:r>
-        <w:rPr>
-          <w:b/>
-          <w:color w:val="FF0000"/>
-          <w:lang w:val="en-GB"/>
-        </w:rPr>
-        <w:t>beschreiben</w:t>
-      </w:r>
-      <w:proofErr w:type="spellEnd"/>
-      <w:r>
-        <w:rPr>
-          <w:b/>
-          <w:color w:val="FF0000"/>
-          <w:lang w:val="en-GB"/>
-        </w:rPr>
-        <w:t xml:space="preserve"> </w:t>
-      </w:r>
-      <w:proofErr w:type="spellStart"/>
-      <w:r>
-        <w:rPr>
-          <w:b/>
-          <w:color w:val="FF0000"/>
-          <w:lang w:val="en-GB"/>
-        </w:rPr>
-        <w:t>wie</w:t>
-      </w:r>
-      <w:proofErr w:type="spellEnd"/>
-      <w:r>
-        <w:rPr>
-          <w:b/>
-          <w:color w:val="FF0000"/>
-          <w:lang w:val="en-GB"/>
-        </w:rPr>
-        <w:t xml:space="preserve"> due die “High CPU Load” Situation </w:t>
-      </w:r>
-      <w:proofErr w:type="spellStart"/>
-      <w:r>
-        <w:rPr>
-          <w:b/>
-          <w:color w:val="FF0000"/>
-          <w:lang w:val="en-GB"/>
-        </w:rPr>
-        <w:t>verursacht</w:t>
-      </w:r>
-      <w:proofErr w:type="spellEnd"/>
-      <w:r>
-        <w:rPr>
-          <w:b/>
-          <w:color w:val="FF0000"/>
-          <w:lang w:val="en-GB"/>
-        </w:rPr>
-        <w:t xml:space="preserve"> hast?</w:t>
-      </w:r>
+        <w:t>degradation of the system’s processing speed.</w:t>
+      </w:r>
+      <w:bookmarkStart w:id="25" w:name="_GoBack"/>
+      <w:bookmarkEnd w:id="25"/>
     </w:p>
     <w:p>
       <w:pPr>
-        <w:rPr>
-          <w:lang w:val="en-GB"/>
-        </w:rPr>
-      </w:pPr>
-    </w:p>
-    <w:p>
-      <w:pPr>
         <w:pStyle w:val="Caption"/>
         <w:keepNext/>
       </w:pPr>
-      <w:bookmarkStart w:id="25" w:name="_Ref197274501"/>
-      <w:bookmarkStart w:id="26" w:name="_Toc197276135"/>
+      <w:bookmarkStart w:id="26" w:name="_Ref197274501"/>
+      <w:bookmarkStart w:id="27" w:name="_Toc197276135"/>
       <w:r>
         <w:t xml:space="preserve">Table </w:t>
       </w:r>
-      <w:r>
-        <w:fldChar w:fldCharType="begin"/>
-      </w:r>
-      <w:r>
-        <w:instrText xml:space="preserve"> SEQ Table \* ARABIC </w:instrText>
-      </w:r>
-      <w:r>
-        <w:fldChar w:fldCharType="separate"/>
-      </w:r>
-      <w:r>
-        <w:rPr>
-          <w:noProof/>
-        </w:rPr>
-        <w:t>4</w:t>
-      </w:r>
-      <w:r>
-        <w:fldChar w:fldCharType="end"/>
-      </w:r>
-      <w:bookmarkEnd w:id="25"/>
+      <w:fldSimple w:instr=" SEQ Table \* ARABIC ">
+        <w:r>
+          <w:rPr>
+            <w:noProof/>
+          </w:rPr>
+          <w:t>4</w:t>
+        </w:r>
+      </w:fldSimple>
+      <w:bookmarkEnd w:id="26"/>
       <w:r>
         <w:t xml:space="preserve">: Minimum, </w:t>
       </w:r>
@@ -6785,7 +6575,7 @@
       <w:r>
         <w:t>load</w:t>
       </w:r>
-      <w:bookmarkEnd w:id="26"/>
+      <w:bookmarkEnd w:id="27"/>
       <w:proofErr w:type="spellEnd"/>
     </w:p>
     <w:tbl>
@@ -7180,7 +6970,7 @@
         <w:rPr>
           <w:noProof/>
         </w:rPr>
-        <w:t>4</w:t>
+        <w:t>5</w:t>
       </w:r>
       <w:r>
         <w:rPr>
@@ -7268,8 +7058,8 @@
           <w:lang w:val="en-GB"/>
         </w:rPr>
       </w:pPr>
-      <w:bookmarkStart w:id="27" w:name="_Ref197274438"/>
-      <w:bookmarkStart w:id="28" w:name="_Toc197276142"/>
+      <w:bookmarkStart w:id="28" w:name="_Ref197274438"/>
+      <w:bookmarkStart w:id="29" w:name="_Toc197276142"/>
       <w:proofErr w:type="spellStart"/>
       <w:r>
         <w:t>Figure</w:t>
@@ -7278,25 +7068,15 @@
       <w:r>
         <w:t xml:space="preserve"> </w:t>
       </w:r>
-      <w:r>
-        <w:fldChar w:fldCharType="begin"/>
-      </w:r>
-      <w:r>
-        <w:instrText xml:space="preserve"> SEQ Figure \* ARABIC </w:instrText>
-      </w:r>
-      <w:r>
-        <w:fldChar w:fldCharType="separate"/>
-      </w:r>
-      <w:r>
-        <w:rPr>
-          <w:noProof/>
-        </w:rPr>
-        <w:t>5</w:t>
-      </w:r>
-      <w:r>
-        <w:fldChar w:fldCharType="end"/>
-      </w:r>
-      <w:bookmarkEnd w:id="27"/>
+      <w:fldSimple w:instr=" SEQ Figure \* ARABIC ">
+        <w:r>
+          <w:rPr>
+            <w:noProof/>
+          </w:rPr>
+          <w:t>5</w:t>
+        </w:r>
+      </w:fldSimple>
+      <w:bookmarkEnd w:id="28"/>
       <w:r>
         <w:t xml:space="preserve">: 50.000 </w:t>
       </w:r>
@@ -7323,7 +7103,7 @@
       <w:r>
         <w:t>load</w:t>
       </w:r>
-      <w:bookmarkEnd w:id="28"/>
+      <w:bookmarkEnd w:id="29"/>
       <w:proofErr w:type="spellEnd"/>
     </w:p>
     <w:p>
@@ -7357,14 +7137,7 @@
           <w:rFonts w:cs="Arial"/>
           <w:lang w:val="en-US"/>
         </w:rPr>
-        <w:t>µ</w:t>
-      </w:r>
-      <w:r>
-        <w:rPr>
-          <w:rFonts w:cs="Arial"/>
-          <w:lang w:val="en-US"/>
-        </w:rPr>
-        <w:t>s</w:t>
+        <w:t>µs</w:t>
       </w:r>
       <w:r>
         <w:rPr>
@@ -7387,147 +7160,86 @@
           <w:lang w:val="en-GB"/>
         </w:rPr>
       </w:pPr>
-      <w:bookmarkStart w:id="29" w:name="_Toc197276127"/>
+      <w:bookmarkStart w:id="30" w:name="_Toc197276127"/>
       <w:r>
         <w:rPr>
           <w:lang w:val="en-GB"/>
         </w:rPr>
-        <w:lastRenderedPageBreak/>
         <w:t>500 000 Measurements</w:t>
-      </w:r>
-      <w:bookmarkEnd w:id="29"/>
-    </w:p>
-    <w:p>
-      <w:pPr>
-        <w:rPr>
-          <w:lang w:val="en-GB"/>
-        </w:rPr>
-      </w:pPr>
-      <w:proofErr w:type="gramStart"/>
-      <w:r>
-        <w:rPr>
-          <w:lang w:val="en-GB"/>
-        </w:rPr>
-        <w:t>Writing our software in Rust,</w:t>
-      </w:r>
-      <w:proofErr w:type="gramEnd"/>
-      <w:r>
-        <w:rPr>
-          <w:lang w:val="en-GB"/>
-        </w:rPr>
-        <w:t xml:space="preserve"> </w:t>
-      </w:r>
-      <w:proofErr w:type="gramStart"/>
-      <w:r>
-        <w:rPr>
-          <w:lang w:val="en-GB"/>
-        </w:rPr>
-        <w:t>it</w:t>
-      </w:r>
-      <w:proofErr w:type="gramEnd"/>
-      <w:r>
-        <w:rPr>
-          <w:lang w:val="en-GB"/>
-        </w:rPr>
-        <w:t xml:space="preserve"> has proven impossib</w:t>
-      </w:r>
-      <w:r>
-        <w:rPr>
-          <w:lang w:val="en-GB"/>
-        </w:rPr>
-        <w:t>le to create buffers as large as</w:t>
-      </w:r>
-      <w:r>
-        <w:rPr>
-          <w:lang w:val="en-GB"/>
-        </w:rPr>
-        <w:t xml:space="preserve"> 500.000</w:t>
-      </w:r>
-      <w:r>
-        <w:rPr>
-          <w:lang w:val="en-GB"/>
-        </w:rPr>
-        <w:t xml:space="preserve"> elements. Unfortunately, we had to re-define the task </w:t>
-      </w:r>
-      <w:proofErr w:type="gramStart"/>
-      <w:r>
-        <w:rPr>
-          <w:lang w:val="en-GB"/>
-        </w:rPr>
-        <w:t>to only gather</w:t>
-      </w:r>
-      <w:proofErr w:type="gramEnd"/>
-      <w:r>
-        <w:rPr>
-          <w:lang w:val="en-GB"/>
-        </w:rPr>
-        <w:t xml:space="preserve"> 250.000 measurements, and similarly to the previous measurements, we do these for both the Nice Level optimized processes and for those without.</w:t>
-      </w:r>
-    </w:p>
-    <w:p>
-      <w:pPr>
-        <w:spacing w:line="240" w:lineRule="auto"/>
-        <w:jc w:val="left"/>
-        <w:rPr>
-          <w:lang w:val="en-GB"/>
-        </w:rPr>
-      </w:pPr>
-    </w:p>
-    <w:p>
-      <w:pPr>
-        <w:pStyle w:val="Heading2"/>
-        <w:rPr>
-          <w:lang w:val="en-GB"/>
-        </w:rPr>
-      </w:pPr>
-      <w:bookmarkStart w:id="30" w:name="_Toc197276128"/>
-      <w:r>
-        <w:rPr>
-          <w:lang w:val="en-GB"/>
-        </w:rPr>
-        <w:t>250 000 Measurements without Nice Level</w:t>
       </w:r>
       <w:bookmarkEnd w:id="30"/>
     </w:p>
     <w:p>
       <w:pPr>
         <w:rPr>
-          <w:lang w:val="en-US"/>
-        </w:rPr>
-      </w:pPr>
-      <w:r>
-        <w:rPr>
-          <w:lang w:val="en-US"/>
-        </w:rPr>
-        <w:t xml:space="preserve">Our measurements for the </w:t>
-      </w:r>
-      <w:r>
-        <w:rPr>
-          <w:lang w:val="en-US"/>
-        </w:rPr>
-        <w:t>250.000</w:t>
-      </w:r>
-      <w:r>
-        <w:rPr>
-          <w:lang w:val="en-US"/>
-        </w:rPr>
-        <w:t xml:space="preserve"> round trip measurement</w:t>
-      </w:r>
-      <w:r>
-        <w:rPr>
-          <w:lang w:val="en-US"/>
-        </w:rPr>
-        <w:t xml:space="preserve"> without Nice Level optimization</w:t>
-      </w:r>
-      <w:r>
-        <w:rPr>
-          <w:lang w:val="en-US"/>
-        </w:rPr>
-        <w:t xml:space="preserve"> yielded the minimum, maximum and mean values, shown in the following table:</w:t>
+          <w:lang w:val="en-GB"/>
+        </w:rPr>
+      </w:pPr>
+      <w:proofErr w:type="gramStart"/>
+      <w:r>
+        <w:rPr>
+          <w:lang w:val="en-GB"/>
+        </w:rPr>
+        <w:t>Writing our software in Rust,</w:t>
+      </w:r>
+      <w:proofErr w:type="gramEnd"/>
+      <w:r>
+        <w:rPr>
+          <w:lang w:val="en-GB"/>
+        </w:rPr>
+        <w:t xml:space="preserve"> </w:t>
+      </w:r>
+      <w:proofErr w:type="gramStart"/>
+      <w:r>
+        <w:rPr>
+          <w:lang w:val="en-GB"/>
+        </w:rPr>
+        <w:t>it</w:t>
+      </w:r>
+      <w:proofErr w:type="gramEnd"/>
+      <w:r>
+        <w:rPr>
+          <w:lang w:val="en-GB"/>
+        </w:rPr>
+        <w:t xml:space="preserve"> has proven impossib</w:t>
+      </w:r>
+      <w:r>
+        <w:rPr>
+          <w:lang w:val="en-GB"/>
+        </w:rPr>
+        <w:t>le to create buffers as large as</w:t>
+      </w:r>
+      <w:r>
+        <w:rPr>
+          <w:lang w:val="en-GB"/>
+        </w:rPr>
+        <w:t xml:space="preserve"> 500.000</w:t>
+      </w:r>
+      <w:r>
+        <w:rPr>
+          <w:lang w:val="en-GB"/>
+        </w:rPr>
+        <w:t xml:space="preserve"> elements. Unfortunately, we had to re-define the task </w:t>
+      </w:r>
+      <w:proofErr w:type="gramStart"/>
+      <w:r>
+        <w:rPr>
+          <w:lang w:val="en-GB"/>
+        </w:rPr>
+        <w:t>to only gather</w:t>
+      </w:r>
+      <w:proofErr w:type="gramEnd"/>
+      <w:r>
+        <w:rPr>
+          <w:lang w:val="en-GB"/>
+        </w:rPr>
+        <w:t xml:space="preserve"> 250.000 measurements, and similarly to the previous measurements, we do these for both the Nice Level optimized processes and for those without.</w:t>
       </w:r>
     </w:p>
     <w:p>
       <w:pPr>
+        <w:spacing w:line="240" w:lineRule="auto"/>
+        <w:jc w:val="left"/>
         <w:rPr>
           <w:lang w:val="en-GB"/>
         </w:rPr>
@@ -7535,31 +7247,63 @@
     </w:p>
     <w:p>
       <w:pPr>
+        <w:pStyle w:val="Heading2"/>
+        <w:rPr>
+          <w:lang w:val="en-GB"/>
+        </w:rPr>
+      </w:pPr>
+      <w:bookmarkStart w:id="31" w:name="_Toc197276128"/>
+      <w:r>
+        <w:rPr>
+          <w:lang w:val="en-GB"/>
+        </w:rPr>
+        <w:t>250 000 Measurements without Nice Level</w:t>
+      </w:r>
+      <w:bookmarkEnd w:id="31"/>
+    </w:p>
+    <w:p>
+      <w:pPr>
+        <w:rPr>
+          <w:lang w:val="en-US"/>
+        </w:rPr>
+      </w:pPr>
+      <w:r>
+        <w:rPr>
+          <w:lang w:val="en-US"/>
+        </w:rPr>
+        <w:t xml:space="preserve">Our measurements for the </w:t>
+      </w:r>
+      <w:r>
+        <w:rPr>
+          <w:lang w:val="en-US"/>
+        </w:rPr>
+        <w:t>250.000 round trip measurement without Nice Level optimization yielded the minimum, maximum and mean values, shown in the following table:</w:t>
+      </w:r>
+    </w:p>
+    <w:p>
+      <w:pPr>
+        <w:rPr>
+          <w:lang w:val="en-GB"/>
+        </w:rPr>
+      </w:pPr>
+    </w:p>
+    <w:p>
+      <w:pPr>
         <w:pStyle w:val="Caption"/>
         <w:keepNext/>
       </w:pPr>
-      <w:bookmarkStart w:id="31" w:name="_Toc197276136"/>
+      <w:bookmarkStart w:id="32" w:name="_Toc197276136"/>
       <w:r>
         <w:t xml:space="preserve">Table </w:t>
       </w:r>
-      <w:r>
-        <w:fldChar w:fldCharType="begin"/>
-      </w:r>
-      <w:r>
-        <w:instrText xml:space="preserve"> SEQ Table \* ARABIC </w:instrText>
-      </w:r>
-      <w:r>
-        <w:fldChar w:fldCharType="separate"/>
-      </w:r>
-      <w:r>
-        <w:rPr>
-          <w:noProof/>
-        </w:rPr>
-        <w:t>5</w:t>
-      </w:r>
-      <w:r>
-        <w:fldChar w:fldCharType="end"/>
-      </w:r>
+      <w:fldSimple w:instr=" SEQ Table \* ARABIC ">
+        <w:r>
+          <w:rPr>
+            <w:noProof/>
+          </w:rPr>
+          <w:t>5</w:t>
+        </w:r>
+      </w:fldSimple>
       <w:r>
         <w:t xml:space="preserve">: Minimum, </w:t>
       </w:r>
@@ -7645,7 +7389,7 @@
       <w:r>
         <w:t>priority</w:t>
       </w:r>
-      <w:bookmarkEnd w:id="31"/>
+      <w:bookmarkEnd w:id="32"/>
       <w:proofErr w:type="spellEnd"/>
     </w:p>
     <w:tbl>
@@ -7988,7 +7732,7 @@
         <w:rPr>
           <w:noProof/>
         </w:rPr>
-        <w:t>5</w:t>
+        <w:t>6</w:t>
       </w:r>
       <w:r>
         <w:rPr>
@@ -8067,8 +7811,8 @@
         <w:pStyle w:val="Caption"/>
         <w:jc w:val="both"/>
       </w:pPr>
-      <w:bookmarkStart w:id="32" w:name="_Ref197274450"/>
-      <w:bookmarkStart w:id="33" w:name="_Toc197276143"/>
+      <w:bookmarkStart w:id="33" w:name="_Ref197274450"/>
+      <w:bookmarkStart w:id="34" w:name="_Toc197276143"/>
       <w:proofErr w:type="spellStart"/>
       <w:r>
         <w:t>Figure</w:t>
@@ -8077,25 +7821,15 @@
       <w:r>
         <w:t xml:space="preserve"> </w:t>
       </w:r>
-      <w:r>
-        <w:fldChar w:fldCharType="begin"/>
-      </w:r>
-      <w:r>
-        <w:instrText xml:space="preserve"> SEQ Figure \* ARABIC </w:instrText>
-      </w:r>
-      <w:r>
-        <w:fldChar w:fldCharType="separate"/>
-      </w:r>
-      <w:r>
-        <w:rPr>
-          <w:noProof/>
-        </w:rPr>
-        <w:t>6</w:t>
-      </w:r>
-      <w:r>
-        <w:fldChar w:fldCharType="end"/>
-      </w:r>
-      <w:bookmarkEnd w:id="32"/>
+      <w:fldSimple w:instr=" SEQ Figure \* ARABIC ">
+        <w:r>
+          <w:rPr>
+            <w:noProof/>
+          </w:rPr>
+          <w:t>6</w:t>
+        </w:r>
+      </w:fldSimple>
+      <w:bookmarkEnd w:id="33"/>
       <w:r>
         <w:t xml:space="preserve">: 250.000 </w:t>
       </w:r>
@@ -8122,7 +7856,7 @@
       <w:r>
         <w:t>priority</w:t>
       </w:r>
-      <w:bookmarkEnd w:id="33"/>
+      <w:bookmarkEnd w:id="34"/>
       <w:proofErr w:type="spellEnd"/>
     </w:p>
     <w:p>
@@ -8389,14 +8123,14 @@
           <w:lang w:val="en-GB"/>
         </w:rPr>
       </w:pPr>
-      <w:bookmarkStart w:id="34" w:name="_Toc197276129"/>
+      <w:bookmarkStart w:id="35" w:name="_Toc197276129"/>
       <w:r>
         <w:rPr>
           <w:lang w:val="en-GB"/>
         </w:rPr>
         <w:t>250 000 Measurements with Nice Level</w:t>
       </w:r>
-      <w:bookmarkEnd w:id="34"/>
+      <w:bookmarkEnd w:id="35"/>
     </w:p>
     <w:p>
       <w:pPr>
@@ -8409,77 +8143,63 @@
           <w:noProof/>
           <w:lang w:val="en-GB"/>
         </w:rPr>
-        <w:t>The measurements for the normal operation with the Nice Level set to the maximum was executed with the expectation</w:t>
+        <w:t>The measurements for the normal operation with the Nice Level set to the maximum was executed with the expectation of seeing improvement in the round-trip times compared to the normally executed measurements once again. The acquired minimum, maximum and mean values are shown in</w:t>
       </w:r>
       <w:r>
         <w:rPr>
           <w:noProof/>
           <w:lang w:val="en-GB"/>
         </w:rPr>
-        <w:t xml:space="preserve"> of seeing improvement in the round-trip times compared to the normally executed measurements once again</w:t>
+        <w:t xml:space="preserve"> </w:t>
       </w:r>
       <w:r>
         <w:rPr>
           <w:noProof/>
           <w:lang w:val="en-GB"/>
         </w:rPr>
-        <w:t>. The acquired minimum, maximum and mean values are shown in</w:t>
+        <w:fldChar w:fldCharType="begin"/>
       </w:r>
       <w:r>
         <w:rPr>
           <w:noProof/>
           <w:lang w:val="en-GB"/>
         </w:rPr>
-        <w:t xml:space="preserve"> </w:t>
+        <w:instrText xml:space="preserve"> REF _Ref197274481 \h </w:instrText>
       </w:r>
       <w:r>
         <w:rPr>
           <w:noProof/>
           <w:lang w:val="en-GB"/>
         </w:rPr>
-        <w:fldChar w:fldCharType="begin"/>
       </w:r>
       <w:r>
         <w:rPr>
           <w:noProof/>
           <w:lang w:val="en-GB"/>
         </w:rPr>
-        <w:instrText xml:space="preserve"> REF _Ref197274481 \h </w:instrText>
+        <w:fldChar w:fldCharType="separate"/>
+      </w:r>
+      <w:r>
+        <w:t xml:space="preserve">Table </w:t>
+      </w:r>
+      <w:r>
+        <w:rPr>
+          <w:noProof/>
+        </w:rPr>
+        <w:t>6</w:t>
       </w:r>
       <w:r>
         <w:rPr>
           <w:noProof/>
           <w:lang w:val="en-GB"/>
         </w:rPr>
+        <w:fldChar w:fldCharType="end"/>
       </w:r>
       <w:r>
         <w:rPr>
           <w:noProof/>
           <w:lang w:val="en-GB"/>
         </w:rPr>
-        <w:fldChar w:fldCharType="separate"/>
-      </w:r>
-      <w:r>
-        <w:t xml:space="preserve">Table </w:t>
-      </w:r>
-      <w:r>
-        <w:rPr>
-          <w:noProof/>
-        </w:rPr>
-        <w:t>6</w:t>
-      </w:r>
-      <w:r>
-        <w:rPr>
-          <w:noProof/>
-          <w:lang w:val="en-GB"/>
-        </w:rPr>
-        <w:fldChar w:fldCharType="end"/>
-      </w:r>
-      <w:r>
-        <w:rPr>
-          <w:noProof/>
-          <w:lang w:val="en-GB"/>
-        </w:rPr>
         <w:t>.</w:t>
       </w:r>
     </w:p>
@@ -8488,30 +8208,20 @@
         <w:pStyle w:val="Caption"/>
         <w:keepNext/>
       </w:pPr>
-      <w:bookmarkStart w:id="35" w:name="_Ref197274481"/>
-      <w:bookmarkStart w:id="36" w:name="_Toc197276137"/>
+      <w:bookmarkStart w:id="36" w:name="_Ref197274481"/>
+      <w:bookmarkStart w:id="37" w:name="_Toc197276137"/>
       <w:r>
         <w:t xml:space="preserve">Table </w:t>
       </w:r>
-      <w:r>
-        <w:fldChar w:fldCharType="begin"/>
-      </w:r>
-      <w:r>
-        <w:instrText xml:space="preserve"> SEQ Table \* ARABIC </w:instrText>
-      </w:r>
-      <w:r>
-        <w:fldChar w:fldCharType="separate"/>
-      </w:r>
-      <w:r>
-        <w:rPr>
-          <w:noProof/>
-        </w:rPr>
-        <w:t>6</w:t>
-      </w:r>
-      <w:r>
-        <w:fldChar w:fldCharType="end"/>
-      </w:r>
-      <w:bookmarkEnd w:id="35"/>
+      <w:fldSimple w:instr=" SEQ Table \* ARABIC ">
+        <w:r>
+          <w:rPr>
+            <w:noProof/>
+          </w:rPr>
+          <w:t>6</w:t>
+        </w:r>
+      </w:fldSimple>
+      <w:bookmarkEnd w:id="36"/>
       <w:r>
         <w:t xml:space="preserve">: Minimum, </w:t>
       </w:r>
@@ -8597,7 +8307,7 @@
       <w:r>
         <w:t>priority</w:t>
       </w:r>
-      <w:bookmarkEnd w:id="36"/>
+      <w:bookmarkEnd w:id="37"/>
       <w:proofErr w:type="spellEnd"/>
     </w:p>
     <w:tbl>
@@ -8632,19 +8342,7 @@
               <w:rPr>
                 <w:lang w:val="en-US"/>
               </w:rPr>
-              <w:t xml:space="preserve">250.000 measurements </w:t>
-            </w:r>
-            <w:r>
-              <w:rPr>
-                <w:lang w:val="en-US"/>
-              </w:rPr>
-              <w:t>with</w:t>
-            </w:r>
-            <w:r>
-              <w:rPr>
-                <w:lang w:val="en-US"/>
-              </w:rPr>
-              <w:t xml:space="preserve"> Nice Level</w:t>
+              <w:t>250.000 measurements with Nice Level</w:t>
             </w:r>
           </w:p>
         </w:tc>
@@ -9680,7 +9378,7 @@
         <w:rPr>
           <w:noProof/>
         </w:rPr>
-        <w:t>6</w:t>
+        <w:t>7</w:t>
       </w:r>
       <w:r>
         <w:rPr>
@@ -9761,8 +9459,8 @@
           <w:bCs w:val="0"/>
         </w:rPr>
       </w:pPr>
-      <w:bookmarkStart w:id="37" w:name="_Ref197274458"/>
-      <w:bookmarkStart w:id="38" w:name="_Toc197276144"/>
+      <w:bookmarkStart w:id="38" w:name="_Ref197274458"/>
+      <w:bookmarkStart w:id="39" w:name="_Toc197276144"/>
       <w:proofErr w:type="spellStart"/>
       <w:r>
         <w:t>Figure</w:t>
@@ -9771,25 +9469,15 @@
       <w:r>
         <w:t xml:space="preserve"> </w:t>
       </w:r>
-      <w:r>
-        <w:fldChar w:fldCharType="begin"/>
-      </w:r>
-      <w:r>
-        <w:instrText xml:space="preserve"> SEQ Figure \* ARABIC </w:instrText>
-      </w:r>
-      <w:r>
-        <w:fldChar w:fldCharType="separate"/>
-      </w:r>
-      <w:r>
-        <w:rPr>
-          <w:noProof/>
-        </w:rPr>
-        <w:t>7</w:t>
-      </w:r>
-      <w:r>
-        <w:fldChar w:fldCharType="end"/>
-      </w:r>
-      <w:bookmarkEnd w:id="37"/>
+      <w:fldSimple w:instr=" SEQ Figure \* ARABIC ">
+        <w:r>
+          <w:rPr>
+            <w:noProof/>
+          </w:rPr>
+          <w:t>7</w:t>
+        </w:r>
+      </w:fldSimple>
+      <w:bookmarkEnd w:id="38"/>
       <w:r>
         <w:t xml:space="preserve">: 250.000 </w:t>
       </w:r>
@@ -9813,7 +9501,7 @@
       <w:r>
         <w:t>priority</w:t>
       </w:r>
-      <w:bookmarkEnd w:id="38"/>
+      <w:bookmarkEnd w:id="39"/>
       <w:proofErr w:type="spellEnd"/>
     </w:p>
     <w:p>
@@ -10085,14 +9773,7 @@
           <w:rFonts w:cs="Arial"/>
           <w:lang w:val="en-US"/>
         </w:rPr>
-        <w:t>µ</w:t>
-      </w:r>
-      <w:r>
-        <w:rPr>
-          <w:rFonts w:cs="Arial"/>
-          <w:lang w:val="en-US"/>
-        </w:rPr>
-        <w:t>s once again.</w:t>
+        <w:t>µs once again.</w:t>
       </w:r>
     </w:p>
     <w:p>
@@ -10113,8 +9794,8 @@
         </w:rPr>
         <w:br w:type="page"/>
       </w:r>
-      <w:bookmarkStart w:id="39" w:name="_Toc94629490"/>
-      <w:bookmarkStart w:id="40" w:name="_Toc197276130"/>
+      <w:bookmarkStart w:id="40" w:name="_Toc94629490"/>
+      <w:bookmarkStart w:id="41" w:name="_Toc197276130"/>
       <w:r>
         <w:rPr>
           <w:lang w:val="en-GB"/>
@@ -10122,11 +9803,9 @@
         <w:lastRenderedPageBreak/>
         <w:t>List of Figures</w:t>
       </w:r>
-      <w:bookmarkEnd w:id="39"/>
       <w:bookmarkEnd w:id="40"/>
+      <w:bookmarkEnd w:id="41"/>
     </w:p>
-    <w:bookmarkStart w:id="41" w:name="_GoBack"/>
-    <w:bookmarkEnd w:id="41"/>
     <w:p>
       <w:pPr>
         <w:pStyle w:val="TableofFigures"/>
@@ -11355,7 +11034,7 @@
       <w:rPr>
         <w:noProof/>
       </w:rPr>
-      <w:t>13</w:t>
+      <w:t>14</w:t>
     </w:r>
     <w:r>
       <w:fldChar w:fldCharType="end"/>
@@ -11469,7 +11148,7 @@
           <wp:docPr id="39" name="Grafik 39">
             <a:extLst xmlns:a="http://schemas.openxmlformats.org/drawingml/2006/main">
               <a:ext uri="{C183D7F6-B498-43B3-948B-1728B52AA6E4}">
-                <adec:decorative xmlns="" xmlns:cx2="http://schemas.microsoft.com/office/drawing/2015/10/21/chartex" xmlns:cx3="http://schemas.microsoft.com/office/drawing/2016/5/9/chartex" xmlns:cx4="http://schemas.microsoft.com/office/drawing/2016/5/10/chartex" xmlns:cx5="http://schemas.microsoft.com/office/drawing/2016/5/11/chartex" xmlns:cx6="http://schemas.microsoft.com/office/drawing/2016/5/12/chartex" xmlns:cx7="http://schemas.microsoft.com/office/drawing/2016/5/13/chartex" xmlns:cx8="http://schemas.microsoft.com/office/drawing/2016/5/14/chartex" xmlns:aink="http://schemas.microsoft.com/office/drawing/2016/ink" xmlns:am3d="http://schemas.microsoft.com/office/drawing/2017/model3d" xmlns:o="urn:schemas-microsoft-com:office:office" xmlns:oel="http://schemas.microsoft.com/office/2019/extlst" xmlns:v="urn:schemas-microsoft-com:vml" xmlns:w10="urn:schemas-microsoft-com:office:word" xmlns:w="http://schemas.openxmlformats.org/wordprocessingml/2006/main" xmlns:w16cex="http://schemas.microsoft.com/office/word/2018/wordml/cex" xmlns:w16cid="http://schemas.microsoft.com/office/word/2016/wordml/cid" xmlns:w16="http://schemas.microsoft.com/office/word/2018/wordml" xmlns:w16du="http://schemas.microsoft.com/office/word/2023/wordml/word16du" xmlns:w16sdtdh="http://schemas.microsoft.com/office/word/2020/wordml/sdtdatahash" xmlns:adec="http://schemas.microsoft.com/office/drawing/2017/decorative" val="1"/>
+                <adec:decorative xmlns:adec="http://schemas.microsoft.com/office/drawing/2017/decorative" xmlns:w16sdtdh="http://schemas.microsoft.com/office/word/2020/wordml/sdtdatahash" xmlns:w16du="http://schemas.microsoft.com/office/word/2023/wordml/word16du" xmlns:w16="http://schemas.microsoft.com/office/word/2018/wordml" xmlns:w16cid="http://schemas.microsoft.com/office/word/2016/wordml/cid" xmlns:w16cex="http://schemas.microsoft.com/office/word/2018/wordml/cex" xmlns:w="http://schemas.openxmlformats.org/wordprocessingml/2006/main" xmlns:w10="urn:schemas-microsoft-com:office:word" xmlns:v="urn:schemas-microsoft-com:vml" xmlns:oel="http://schemas.microsoft.com/office/2019/extlst" xmlns:o="urn:schemas-microsoft-com:office:office" xmlns:am3d="http://schemas.microsoft.com/office/drawing/2017/model3d" xmlns:aink="http://schemas.microsoft.com/office/drawing/2016/ink" xmlns:cx8="http://schemas.microsoft.com/office/drawing/2016/5/14/chartex" xmlns:cx7="http://schemas.microsoft.com/office/drawing/2016/5/13/chartex" xmlns:cx6="http://schemas.microsoft.com/office/drawing/2016/5/12/chartex" xmlns:cx5="http://schemas.microsoft.com/office/drawing/2016/5/11/chartex" xmlns:cx4="http://schemas.microsoft.com/office/drawing/2016/5/10/chartex" xmlns:cx3="http://schemas.microsoft.com/office/drawing/2016/5/9/chartex" xmlns:cx2="http://schemas.microsoft.com/office/drawing/2015/10/21/chartex" xmlns="" val="1"/>
               </a:ext>
             </a:extLst>
           </wp:docPr>
@@ -11483,7 +11162,7 @@
                   <pic:cNvPr id="39" name="Grafik 39">
                     <a:extLst>
                       <a:ext uri="{C183D7F6-B498-43B3-948B-1728B52AA6E4}">
-                        <adec:decorative xmlns="" xmlns:cx2="http://schemas.microsoft.com/office/drawing/2015/10/21/chartex" xmlns:cx3="http://schemas.microsoft.com/office/drawing/2016/5/9/chartex" xmlns:cx4="http://schemas.microsoft.com/office/drawing/2016/5/10/chartex" xmlns:cx5="http://schemas.microsoft.com/office/drawing/2016/5/11/chartex" xmlns:cx6="http://schemas.microsoft.com/office/drawing/2016/5/12/chartex" xmlns:cx7="http://schemas.microsoft.com/office/drawing/2016/5/13/chartex" xmlns:cx8="http://schemas.microsoft.com/office/drawing/2016/5/14/chartex" xmlns:aink="http://schemas.microsoft.com/office/drawing/2016/ink" xmlns:am3d="http://schemas.microsoft.com/office/drawing/2017/model3d" xmlns:o="urn:schemas-microsoft-com:office:office" xmlns:oel="http://schemas.microsoft.com/office/2019/extlst" xmlns:v="urn:schemas-microsoft-com:vml" xmlns:w10="urn:schemas-microsoft-com:office:word" xmlns:w="http://schemas.openxmlformats.org/wordprocessingml/2006/main" xmlns:w16cex="http://schemas.microsoft.com/office/word/2018/wordml/cex" xmlns:w16cid="http://schemas.microsoft.com/office/word/2016/wordml/cid" xmlns:w16="http://schemas.microsoft.com/office/word/2018/wordml" xmlns:w16du="http://schemas.microsoft.com/office/word/2023/wordml/word16du" xmlns:w16sdtdh="http://schemas.microsoft.com/office/word/2020/wordml/sdtdatahash" xmlns:adec="http://schemas.microsoft.com/office/drawing/2017/decorative" val="1"/>
+                        <adec:decorative xmlns:adec="http://schemas.microsoft.com/office/drawing/2017/decorative" xmlns:w16sdtdh="http://schemas.microsoft.com/office/word/2020/wordml/sdtdatahash" xmlns:w16du="http://schemas.microsoft.com/office/word/2023/wordml/word16du" xmlns:w16="http://schemas.microsoft.com/office/word/2018/wordml" xmlns:w16cid="http://schemas.microsoft.com/office/word/2016/wordml/cid" xmlns:w16cex="http://schemas.microsoft.com/office/word/2018/wordml/cex" xmlns:w="http://schemas.openxmlformats.org/wordprocessingml/2006/main" xmlns:w10="urn:schemas-microsoft-com:office:word" xmlns:v="urn:schemas-microsoft-com:vml" xmlns:oel="http://schemas.microsoft.com/office/2019/extlst" xmlns:o="urn:schemas-microsoft-com:office:office" xmlns:am3d="http://schemas.microsoft.com/office/drawing/2017/model3d" xmlns:aink="http://schemas.microsoft.com/office/drawing/2016/ink" xmlns:cx8="http://schemas.microsoft.com/office/drawing/2016/5/14/chartex" xmlns:cx7="http://schemas.microsoft.com/office/drawing/2016/5/13/chartex" xmlns:cx6="http://schemas.microsoft.com/office/drawing/2016/5/12/chartex" xmlns:cx5="http://schemas.microsoft.com/office/drawing/2016/5/11/chartex" xmlns:cx4="http://schemas.microsoft.com/office/drawing/2016/5/10/chartex" xmlns:cx3="http://schemas.microsoft.com/office/drawing/2016/5/9/chartex" xmlns:cx2="http://schemas.microsoft.com/office/drawing/2015/10/21/chartex" xmlns="" val="1"/>
                       </a:ext>
                     </a:extLst>
                   </pic:cNvPr>
@@ -17687,35 +17366,6 @@
         </w:p>
       </w:docPartBody>
     </w:docPart>
-    <w:docPart>
-      <w:docPartPr>
-        <w:name w:val="C2AD58F72CA045269568DD4C5FB78575"/>
-        <w:category>
-          <w:name w:val="General"/>
-          <w:gallery w:val="placeholder"/>
-        </w:category>
-        <w:types>
-          <w:type w:val="bbPlcHdr"/>
-        </w:types>
-        <w:behaviors>
-          <w:behavior w:val="content"/>
-        </w:behaviors>
-        <w:guid w:val="{D3389611-04FE-4C9A-BCC8-7E5B3C9605C0}"/>
-      </w:docPartPr>
-      <w:docPartBody>
-        <w:p>
-          <w:pPr>
-            <w:pStyle w:val="C2AD58F72CA045269568DD4C5FB78575"/>
-          </w:pPr>
-          <w:r>
-            <w:rPr>
-              <w:rStyle w:val="PlaceholderText"/>
-            </w:rPr>
-            <w:t>Klicken oder tippen Sie hier, um Text einzugeben.</w:t>
-          </w:r>
-        </w:p>
-      </w:docPartBody>
-    </w:docPart>
   </w:docParts>
 </w:glossaryDocument>
 </file>
@@ -17734,14 +17384,14 @@
     <w:charset w:val="00"/>
     <w:family w:val="roman"/>
     <w:pitch w:val="variable"/>
-    <w:sig w:usb0="E0002AFF" w:usb1="C0007843" w:usb2="00000009" w:usb3="00000000" w:csb0="000001FF" w:csb1="00000000"/>
+    <w:sig w:usb0="E0002EFF" w:usb1="C000785B" w:usb2="00000009" w:usb3="00000000" w:csb0="000001FF" w:csb1="00000000"/>
   </w:font>
   <w:font w:name="Arial">
     <w:panose1 w:val="020B0604020202020204"/>
     <w:charset w:val="00"/>
     <w:family w:val="swiss"/>
     <w:pitch w:val="variable"/>
-    <w:sig w:usb0="E0002AFF" w:usb1="C0007843" w:usb2="00000009" w:usb3="00000000" w:csb0="000001FF" w:csb1="00000000"/>
+    <w:sig w:usb0="E0002EFF" w:usb1="C000785B" w:usb2="00000009" w:usb3="00000000" w:csb0="000001FF" w:csb1="00000000"/>
   </w:font>
   <w:font w:name="Wingdings">
     <w:panose1 w:val="05000000000000000000"/>
@@ -17783,21 +17433,21 @@
     <w:charset w:val="00"/>
     <w:family w:val="swiss"/>
     <w:pitch w:val="variable"/>
-    <w:sig w:usb0="E0002AFF" w:usb1="4000ACFF" w:usb2="00000001" w:usb3="00000000" w:csb0="000001FF" w:csb1="00000000"/>
+    <w:sig w:usb0="E4002EFF" w:usb1="C000247B" w:usb2="00000009" w:usb3="00000000" w:csb0="000001FF" w:csb1="00000000"/>
   </w:font>
   <w:font w:name="Cambria">
     <w:panose1 w:val="02040503050406030204"/>
     <w:charset w:val="00"/>
     <w:family w:val="roman"/>
     <w:pitch w:val="variable"/>
-    <w:sig w:usb0="A00002EF" w:usb1="4000004B" w:usb2="00000000" w:usb3="00000000" w:csb0="0000019F" w:csb1="00000000"/>
+    <w:sig w:usb0="E00006FF" w:usb1="420024FF" w:usb2="02000000" w:usb3="00000000" w:csb0="0000019F" w:csb1="00000000"/>
   </w:font>
   <w:font w:name="Calibri Light">
     <w:panose1 w:val="020F0302020204030204"/>
     <w:charset w:val="00"/>
     <w:family w:val="swiss"/>
     <w:pitch w:val="variable"/>
-    <w:sig w:usb0="A0002AEF" w:usb1="4000207B" w:usb2="00000000" w:usb3="00000000" w:csb0="000001FF" w:csb1="00000000"/>
+    <w:sig w:usb0="E4002EFF" w:usb1="C000247B" w:usb2="00000009" w:usb3="00000000" w:csb0="000001FF" w:csb1="00000000"/>
   </w:font>
 </w:fonts>
 </file>
@@ -17823,6 +17473,7 @@
     <w:rsid w:val="002179B4"/>
     <w:rsid w:val="004323EE"/>
     <w:rsid w:val="00447F35"/>
+    <w:rsid w:val="005129F8"/>
     <w:rsid w:val="006D03C2"/>
     <w:rsid w:val="008D6FD6"/>
     <w:rsid w:val="00915E87"/>
@@ -18681,7 +18332,7 @@
 </file>
 
 <file path=customXml/itemProps2.xml><?xml version="1.0" encoding="utf-8"?>
-<ds:datastoreItem xmlns:ds="http://schemas.openxmlformats.org/officeDocument/2006/customXml" ds:itemID="{A5BEDE18-724C-4118-A252-34B1C7956003}">
+<ds:datastoreItem xmlns:ds="http://schemas.openxmlformats.org/officeDocument/2006/customXml" ds:itemID="{80F1D7B0-1948-4A60-89F3-652639D89DDE}">
   <ds:schemaRefs>
     <ds:schemaRef ds:uri="http://schemas.openxmlformats.org/officeDocument/2006/bibliography"/>
   </ds:schemaRefs>

</xml_diff>